<commit_message>
Revisa o DFD para o PCA (v1.1) e o DFD da contratação (v1.2)
- DFD para o PCA: finalidade (elaboração x alteração do PCA), alinhamento com o
  planejamento estratégico, campos do PCA consolidado (tipo, subelemento,
  renovação, critério do quantitativo), data provável mantida na renovação e
  fluxo submissão -> análise do coordenador -> aprovação da Presidência só na
  alteração. Caixas desenhadas trocadas por (  ) e linhas por {{CAMPOS}}.
- DFD da contratação: seção "Origem da demanda" ligada ao DFD para o PCA,
  objeto e quantidade separados, planejamento estratégico separado do PCA,
  opção "dispensada de indicação no PCA", estimativa com fonte e data,
  prioridade com enquadramento e sem declaração automática de orçamento.
- Fichas reescritas como regra operacional; versões anteriores em _arquivo/.

Co-Authored-By: Claude Opus 5.5 <noreply@anthropic.com>
</commit_message>
<xml_diff>
--- a/05_minutas/DFD/DFD_MINUTA_MAE.docx
+++ b/05_minutas/DFD/DFD_MINUTA_MAE.docx
@@ -33,17 +33,20 @@
     </w:p>
     <w:p/>
     <w:p>
+      <w:pPr>
+        <w:keepNext/>
+      </w:pPr>
       <w:r>
         <w:rPr>
           <w:b/>
         </w:rPr>
-        <w:t>IDENTIFICAÇÃO DA UNIDADE DEMANDANTE:</w:t>
+        <w:t>1. IDENTIFICAÇÃO DA UNIDADE DEMANDANTE:</w:t>
       </w:r>
     </w:p>
     <w:tbl>
       <w:tblPr>
         <w:tblStyle w:val="Tabelacomgrade"/>
-        <w:tblW w:type="auto" w:w="0"/>
+        <w:tblW w:type="dxa" w:w="9810"/>
         <w:tblLook w:firstColumn="1" w:firstRow="1" w:lastColumn="0" w:lastRow="0" w:noHBand="0" w:noVBand="1" w:val="04A0"/>
       </w:tblPr>
       <w:tblGrid>
@@ -94,14 +97,86 @@
           </w:p>
         </w:tc>
       </w:tr>
+      <w:tr>
+        <w:tc>
+          <w:tcPr>
+            <w:tcW w:type="dxa" w:w="4905"/>
+          </w:tcPr>
+          <w:p>
+            <w:r>
+              <w:t>Cargo/função:</w:t>
+            </w:r>
+          </w:p>
+        </w:tc>
+        <w:tc>
+          <w:tcPr>
+            <w:tcW w:type="dxa" w:w="4905"/>
+          </w:tcPr>
+          <w:p>
+            <w:r>
+              <w:t>{{CARGO_FUNCAO}}</w:t>
+            </w:r>
+          </w:p>
+        </w:tc>
+      </w:tr>
     </w:tbl>
     <w:p/>
     <w:p>
+      <w:pPr>
+        <w:keepNext/>
+      </w:pPr>
       <w:r>
         <w:rPr>
           <w:b/>
         </w:rPr>
-        <w:t>JUSTIFICATIVA DA NECESSIDADE DA DEMANDA:</w:t>
+        <w:t>2. ORIGEM DA DEMANDA:</w:t>
+      </w:r>
+    </w:p>
+    <w:p>
+      <w:pPr>
+        <w:jc w:val="left"/>
+      </w:pPr>
+      <w:r>
+        <w:t>(  ) A demanda foi formalizada no DFD para o PCA nº {{NUMERO_DFD_PCA}}, que originou o item {{ITEM_PCA}} do Plano de Contratações Anual de {{ANO_PCA}}. Permanecem válidos os elementos daquele documento, salvo os atualizados neste DFD.</w:t>
+      </w:r>
+    </w:p>
+    <w:p>
+      <w:pPr>
+        <w:jc w:val="left"/>
+      </w:pPr>
+      <w:r>
+        <w:t>(  ) Não há DFD para o PCA anterior relativo a esta demanda.</w:t>
+      </w:r>
+    </w:p>
+    <w:p>
+      <w:pPr>
+        <w:jc w:val="both"/>
+      </w:pPr>
+      <w:r>
+        <w:rPr>
+          <w:b/>
+          <w:color w:val="FF0000"/>
+        </w:rPr>
+        <w:t xml:space="preserve">Orientação (excluir antes da assinatura): </w:t>
+      </w:r>
+      <w:r>
+        <w:rPr>
+          <w:i/>
+          <w:color w:val="FF0000"/>
+        </w:rPr>
+        <w:t>havendo DFD para o PCA atual e completo, as seções 3 a 5 podem remeter a ele ("conforme o DFD para o PCA nº ..."), registrando apenas o que mudou — quantidade, estimativa, data. Se a necessidade, a quantidade ou o contexto mudaram substancialmente, preencher integralmente.</w:t>
+      </w:r>
+    </w:p>
+    <w:p/>
+    <w:p>
+      <w:pPr>
+        <w:keepNext/>
+      </w:pPr>
+      <w:r>
+        <w:rPr>
+          <w:b/>
+        </w:rPr>
+        <w:t>3. JUSTIFICATIVA DA NECESSIDADE DA DEMANDA:</w:t>
       </w:r>
     </w:p>
     <w:p>
@@ -112,13 +187,35 @@
         <w:t>{{JUSTIFICATIVA_NECESSIDADE}}</w:t>
       </w:r>
     </w:p>
+    <w:p>
+      <w:pPr>
+        <w:jc w:val="both"/>
+      </w:pPr>
+      <w:r>
+        <w:rPr>
+          <w:b/>
+          <w:color w:val="FF0000"/>
+        </w:rPr>
+        <w:t xml:space="preserve">Orientação (excluir antes da assinatura): </w:t>
+      </w:r>
+      <w:r>
+        <w:rPr>
+          <w:i/>
+          <w:color w:val="FF0000"/>
+        </w:rPr>
+        <w:t>responder, de forma objetiva: qual é a situação atual ou o problema; por que há necessidade administrativa; qual o prejuízo ou risco de não atender; qual resultado a Câmara pretende alcançar. Evitar fórmulas genéricas como "necessário ao bom funcionamento".</w:t>
+      </w:r>
+    </w:p>
     <w:p/>
     <w:p>
+      <w:pPr>
+        <w:keepNext/>
+      </w:pPr>
       <w:r>
         <w:rPr>
           <w:b/>
         </w:rPr>
-        <w:t>DESCRIÇÃO SUCINTA DO OBJETO E QUANTIDADE:</w:t>
+        <w:t>4. DESCRIÇÃO SUCINTA DO OBJETO:</w:t>
       </w:r>
     </w:p>
     <w:p>
@@ -126,16 +223,38 @@
         <w:jc w:val="both"/>
       </w:pPr>
       <w:r>
-        <w:t>{{DESCRICAO_OBJETO_QUANTIDADE}}</w:t>
+        <w:t>{{DESCRICAO_OBJETO}}</w:t>
+      </w:r>
+    </w:p>
+    <w:p>
+      <w:pPr>
+        <w:jc w:val="both"/>
+      </w:pPr>
+      <w:r>
+        <w:rPr>
+          <w:b/>
+          <w:color w:val="FF0000"/>
+        </w:rPr>
+        <w:t xml:space="preserve">Orientação (excluir antes da assinatura): </w:t>
+      </w:r>
+      <w:r>
+        <w:rPr>
+          <w:i/>
+          <w:color w:val="FF0000"/>
+        </w:rPr>
+        <w:t>descrever a necessidade, não a solução: sem marca, modelo, especificação técnica detalhada, requisitos de habilitação ou cláusulas de TR, que cabem ao ETP e ao Termo de Referência. É vedada a aquisição de bem de consumo de luxo (Portaria nº 08/2024, art. 3º).</w:t>
       </w:r>
     </w:p>
     <w:p/>
     <w:p>
+      <w:pPr>
+        <w:keepNext/>
+      </w:pPr>
       <w:r>
         <w:rPr>
           <w:b/>
         </w:rPr>
-        <w:t>ALINHAMENTO AO PLANO DE CONTRATAÇÃO ANUAL (PCA):</w:t>
+        <w:t>5. QUANTIDADE ESTIMADA:</w:t>
       </w:r>
     </w:p>
     <w:p>
@@ -143,21 +262,88 @@
         <w:jc w:val="both"/>
       </w:pPr>
       <w:r>
-        <w:t>Identificar o alinhamento da demanda ao Plano de Contratações Anual (PCA) da Câmara Municipal de Itanhandu, publicado em seu sítio eletrônico oficial e no PNCP. Assinale a situação aplicável:</w:t>
+        <w:t>Quantidade: {{QUANTIDADE_ESTIMADA}}</w:t>
       </w:r>
     </w:p>
     <w:p>
       <w:pPr>
+        <w:jc w:val="both"/>
+      </w:pPr>
+      <w:r>
+        <w:t>Critério utilizado para o dimensionamento: {{CRITERIO_QUANTIDADE}}</w:t>
+      </w:r>
+    </w:p>
+    <w:p>
+      <w:pPr>
+        <w:jc w:val="both"/>
+      </w:pPr>
+      <w:r>
+        <w:rPr>
+          <w:b/>
+          <w:color w:val="FF0000"/>
+        </w:rPr>
+        <w:t xml:space="preserve">Orientação (excluir antes da assinatura): </w:t>
+      </w:r>
+      <w:r>
+        <w:rPr>
+          <w:i/>
+          <w:color w:val="FF0000"/>
+        </w:rPr>
+        <w:t>quando aplicável, considerar a expectativa de consumo anual (art. 3º, III, da Portaria nº 04/2024). Exemplos: "12 unidades, correspondentes aos 12 postos de trabalho que terão equipamentos substituídos"; "24 unidades, com base no consumo dos últimos 12 meses".</w:t>
+      </w:r>
+    </w:p>
+    <w:p/>
+    <w:p>
+      <w:pPr>
+        <w:keepNext/>
+      </w:pPr>
+      <w:r>
+        <w:rPr>
+          <w:b/>
+        </w:rPr>
+        <w:t>6. ALINHAMENTO COM O PLANEJAMENTO ESTRATÉGICO:</w:t>
+      </w:r>
+    </w:p>
+    <w:p>
+      <w:pPr>
         <w:jc w:val="left"/>
       </w:pPr>
       <w:r>
-        <w:t>(  ) A demanda está prevista no Plano de Contratações Anual, conforme detalhamento a seguir:</w:t>
+        <w:t>(  ) A demanda está relacionada ao planejamento estratégico da Câmara. Instrumento e objetivo relacionados: {{ALINHAMENTO_ESTRATEGICO}}.</w:t>
+      </w:r>
+    </w:p>
+    <w:p>
+      <w:pPr>
+        <w:jc w:val="left"/>
+      </w:pPr>
+      <w:r>
+        <w:t>(  ) Não há planejamento estratégico formal aplicável à demanda.</w:t>
+      </w:r>
+    </w:p>
+    <w:p/>
+    <w:p>
+      <w:pPr>
+        <w:keepNext/>
+      </w:pPr>
+      <w:r>
+        <w:rPr>
+          <w:b/>
+        </w:rPr>
+        <w:t>7. SITUAÇÃO DA DEMANDA NO PLANO DE CONTRATAÇÕES ANUAL (PCA):</w:t>
+      </w:r>
+    </w:p>
+    <w:p>
+      <w:pPr>
+        <w:jc w:val="left"/>
+      </w:pPr>
+      <w:r>
+        <w:t>(  ) Prevista no Plano de Contratações Anual de {{ANO_PCA}}, conforme detalhamento a seguir:</w:t>
       </w:r>
     </w:p>
     <w:tbl>
       <w:tblPr>
         <w:tblStyle w:val="Tabelacomgrade"/>
-        <w:tblW w:type="auto" w:w="0"/>
+        <w:tblW w:type="dxa" w:w="9810"/>
         <w:tblLook w:firstColumn="1" w:firstRow="1" w:lastColumn="0" w:lastRow="0" w:noHBand="0" w:noVBand="1" w:val="04A0"/>
       </w:tblPr>
       <w:tblGrid>
@@ -247,7 +433,7 @@
         <w:jc w:val="left"/>
       </w:pPr>
       <w:r>
-        <w:t>ou</w:t>
+        <w:t>(  ) Não prevista no Plano de Contratações Anual. A presente justificativa subsidiará a proposta de alteração do Plano, cuja aprovação compete à Presidência da Câmara Municipal, nos termos do art. 6º da Portaria nº 04/2024: {{JUSTIFICATIVA_INCLUSAO_PCA}}</w:t>
       </w:r>
     </w:p>
     <w:p>
@@ -255,15 +441,26 @@
         <w:jc w:val="both"/>
       </w:pPr>
       <w:r>
-        <w:t>(  ) A demanda não está prevista no Plano de Contratações Anual, e sua inclusão se justifica pelo(s) seguinte(s) motivo(s): {{JUSTIFICATIVA_INCLUSAO_PCA}}</w:t>
+        <w:rPr>
+          <w:b/>
+          <w:color w:val="FF0000"/>
+        </w:rPr>
+        <w:t xml:space="preserve">Orientação (excluir antes da assinatura): </w:t>
+      </w:r>
+      <w:r>
+        <w:rPr>
+          <w:i/>
+          <w:color w:val="FF0000"/>
+        </w:rPr>
+        <w:t>exemplos de justificativa: demanda decorrente de novo projeto aprovado pela Administração e iniciado no exercício corrente; demanda inexistente à época da elaboração do PCA. A alteração do PCA é formalizada pelo DFD para o PCA (finalidade "alteração", com aprovação da Presidência); este DFD não a substitui.</w:t>
       </w:r>
     </w:p>
     <w:p>
       <w:pPr>
-        <w:jc w:val="both"/>
+        <w:jc w:val="left"/>
       </w:pPr>
       <w:r>
-        <w:t>A alteração do Plano de Contratações Anual durante o exercício de sua execução depende de justificativa aprovada pela Presidência da Câmara Municipal, nos termos do art. 6º da Portaria nº 04/2024.</w:t>
+        <w:t>(  ) Dispensada de indicação no PCA, nos termos do art. 2º, § 3º, inciso {{INCISO_DISPENSA_PCA}}, da Portaria nº 04/2024: {{FUNDAMENTO_DISPENSA_PCA}}</w:t>
       </w:r>
     </w:p>
     <w:p>
@@ -271,24 +468,30 @@
         <w:jc w:val="both"/>
       </w:pPr>
       <w:r>
-        <w:t>Exemplos de justificativa: a) demanda decorrente de novo projeto aprovado pela Administração e iniciado no exercício corrente; b) demanda inexistente à época da elaboração do PCA.</w:t>
+        <w:rPr>
+          <w:b/>
+          <w:color w:val="FF0000"/>
+        </w:rPr>
+        <w:t xml:space="preserve">Orientação (excluir antes da assinatura): </w:t>
       </w:r>
-    </w:p>
-    <w:p>
-      <w:pPr>
-        <w:jc w:val="both"/>
-      </w:pPr>
       <w:r>
-        <w:t>A inclusão da demanda observa a disponibilidade orçamentária da Câmara Municipal de Itanhandu e não extrapola o orçamento previsto para a unidade.</w:t>
+        <w:rPr>
+          <w:i/>
+          <w:color w:val="FF0000"/>
+        </w:rPr>
+        <w:t>só se aplica às hipóteses do art. 75, VI, VII e VIII, da Lei nº 14.133/2021 (inciso I) e às pequenas compras e serviços de pronto pagamento do art. 95, § 2º (inciso II). A dispensa em razão do valor (art. 75, I e II) NÃO está dispensada de indicação no PCA.</w:t>
       </w:r>
     </w:p>
     <w:p/>
     <w:p>
+      <w:pPr>
+        <w:keepNext/>
+      </w:pPr>
       <w:r>
         <w:rPr>
           <w:b/>
         </w:rPr>
-        <w:t>ESTIMATIVA PRELIMINAR DO VALOR DA CONTRATAÇÃO</w:t>
+        <w:t>8. ESTIMATIVA SUMÁRIA DO VALOR DA CONTRATAÇÃO:</w:t>
       </w:r>
     </w:p>
     <w:p>
@@ -296,16 +499,46 @@
         <w:jc w:val="both"/>
       </w:pPr>
       <w:r>
-        <w:t>{{ESTIMATIVA_VALOR}}</w:t>
+        <w:t>Valor estimado: R$ {{ESTIMATIVA_VALOR}}</w:t>
+      </w:r>
+    </w:p>
+    <w:p>
+      <w:pPr>
+        <w:jc w:val="both"/>
+      </w:pPr>
+      <w:r>
+        <w:t>Referência utilizada para a estimativa: {{FONTE_ESTIMATIVA}}</w:t>
+      </w:r>
+    </w:p>
+    <w:p>
+      <w:pPr>
+        <w:jc w:val="both"/>
+      </w:pPr>
+      <w:r>
+        <w:t>Data da referência ou consulta: {{DATA_ESTIMATIVA}}</w:t>
+      </w:r>
+    </w:p>
+    <w:p>
+      <w:pPr>
+        <w:jc w:val="both"/>
+      </w:pPr>
+      <w:r>
+        <w:rPr>
+          <w:i/>
+        </w:rPr>
+        <w:t>A presente estimativa possui caráter sumário, foi realizada por procedimento simplificado e destina-se ao planejamento inicial da demanda, não substituindo a pesquisa de preços (art. 3º, § 1º, da Portaria nº 04/2024).</w:t>
       </w:r>
     </w:p>
     <w:p/>
     <w:p>
+      <w:pPr>
+        <w:keepNext/>
+      </w:pPr>
       <w:r>
         <w:rPr>
           <w:b/>
         </w:rPr>
-        <w:t>PREVISÃO PARA CONCLUSÃO DA CONTRATAÇÃO OU AQUISIÇÃO DO BEM</w:t>
+        <w:t>9. PREVISÃO PARA CONCLUSÃO DA CONTRATAÇÃO OU AQUISIÇÃO DO BEM:</w:t>
       </w:r>
     </w:p>
     <w:p>
@@ -318,28 +551,42 @@
     </w:p>
     <w:p/>
     <w:p>
+      <w:pPr>
+        <w:keepNext/>
+      </w:pPr>
       <w:r>
         <w:rPr>
           <w:b/>
         </w:rPr>
-        <w:t>VINCULAÇÃO OU DEPENDÊNCIA EM RELAÇÃO A OUTRA CONTRATAÇÃO</w:t>
+        <w:t>10. VINCULAÇÃO OU DEPENDÊNCIA EM RELAÇÃO A OUTRA CONTRATAÇÃO:</w:t>
       </w:r>
     </w:p>
     <w:p>
       <w:pPr>
-        <w:jc w:val="both"/>
+        <w:jc w:val="left"/>
       </w:pPr>
       <w:r>
-        <w:t>{{VINCULACAO_DEPENDENCIA}}</w:t>
+        <w:t>(  ) Não há vinculação ou dependência desta contratação em relação a outra.</w:t>
+      </w:r>
+    </w:p>
+    <w:p>
+      <w:pPr>
+        <w:jc w:val="left"/>
+      </w:pPr>
+      <w:r>
+        <w:t>(  ) Há vinculação ou dependência desta contratação em relação à seguinte: {{VINCULACAO_DEPENDENCIA}}</w:t>
       </w:r>
     </w:p>
     <w:p/>
     <w:p>
+      <w:pPr>
+        <w:keepNext/>
+      </w:pPr>
       <w:r>
         <w:rPr>
           <w:b/>
         </w:rPr>
-        <w:t>GRAU DE PRIORIDADE DA DEMANDA</w:t>
+        <w:t>11. GRAU DE PRIORIDADE DA DEMANDA:</w:t>
       </w:r>
     </w:p>
     <w:p>
@@ -355,29 +602,72 @@
         <w:jc w:val="both"/>
       </w:pPr>
       <w:r>
-        <w:t>Classificação conforme os critérios do art. 3º, §2º, da Portaria nº 04/2024. Justificativa do enquadramento: {{JUSTIFICATIVA_PRIORIDADE}}</w:t>
+        <w:t>Enquadramento: art. 3º, § 2º, inciso {{INCISO_PRIORIDADE}}, alínea {{ALINEA_PRIORIDADE}} (se houver), da Portaria nº 04/2024.</w:t>
+      </w:r>
+    </w:p>
+    <w:p>
+      <w:pPr>
+        <w:jc w:val="both"/>
+      </w:pPr>
+      <w:r>
+        <w:t>Justificativa do enquadramento: {{JUSTIFICATIVA_PRIORIDADE}}</w:t>
+      </w:r>
+    </w:p>
+    <w:p>
+      <w:pPr>
+        <w:jc w:val="both"/>
+      </w:pPr>
+      <w:r>
+        <w:rPr>
+          <w:b/>
+          <w:color w:val="FF0000"/>
+        </w:rPr>
+        <w:t xml:space="preserve">Orientação (excluir antes da assinatura): </w:t>
+      </w:r>
+      <w:r>
+        <w:rPr>
+          <w:i/>
+          <w:color w:val="FF0000"/>
+        </w:rPr>
+        <w:t>ALTA (inciso I): a) renovação ou prorrogação de serviço continuado em execução; b) material de consumo ou serviço cuja falta possa comprometer o funcionamento da Câmara; c) atendimento de prazo legal, decisão judicial ou determinação de órgão de controle; d) contratação acessória ou vinculada a outra de prioridade alta; e) assim classificada pelo Presidente. MÉDIA (inciso II, sem alíneas): serviço sem contratação vigente; material de consumo não compreendido no inciso I; bem permanente para substituir bem danificado ou deteriorado; acessória ou vinculada a contratação de prioridade média. BAIXA (inciso III): bem permanente que não substitua outro existente; obras e serviços não incluídos nos incisos I e II. Não marcar prioridade sem enquadramento.</w:t>
       </w:r>
     </w:p>
     <w:p/>
     <w:p>
       <w:pPr>
+        <w:keepNext/>
         <w:jc w:val="left"/>
       </w:pPr>
       <w:r>
         <w:t>Itanhandu/MG, {{DATA_ASSINATURA}}.</w:t>
       </w:r>
     </w:p>
-    <w:p/>
     <w:p>
       <w:pPr>
+        <w:keepNext/>
         <w:jc w:val="left"/>
       </w:pPr>
+      <w:r/>
+    </w:p>
+    <w:p>
+      <w:pPr>
+        <w:keepNext/>
+        <w:jc w:val="left"/>
+      </w:pPr>
+      <w:r/>
+    </w:p>
+    <w:p>
+      <w:pPr>
+        <w:keepNext/>
+        <w:jc w:val="left"/>
+      </w:pPr>
       <w:r>
-        <w:t>Assinado eletronicamente</w:t>
+        <w:t>___________________________________________</w:t>
       </w:r>
     </w:p>
     <w:p>
       <w:pPr>
+        <w:keepNext/>
         <w:jc w:val="left"/>
       </w:pPr>
       <w:r>
@@ -389,7 +679,7 @@
         <w:jc w:val="left"/>
       </w:pPr>
       <w:r>
-        <w:t>Requisitante</w:t>
+        <w:t>{{CARGO_FUNCAO}} — Requisitante</w:t>
       </w:r>
     </w:p>
     <w:sectPr>

</xml_diff>

<commit_message>
Revert "Revisa o DFD para o PCA (v1.1) e o DFD da contratação (v1.2)"
This reverts commit a511c89 a pedido do usuário: DFD da contratação volta à v1.1 e
DFD para o PCA à v1.0, com fichas, changelog e controle anteriores.

Co-Authored-By: Claude Opus 5.5 <noreply@anthropic.com>
</commit_message>
<xml_diff>
--- a/05_minutas/DFD/DFD_MINUTA_MAE.docx
+++ b/05_minutas/DFD/DFD_MINUTA_MAE.docx
@@ -33,20 +33,17 @@
     </w:p>
     <w:p/>
     <w:p>
-      <w:pPr>
-        <w:keepNext/>
-      </w:pPr>
       <w:r>
         <w:rPr>
           <w:b/>
         </w:rPr>
-        <w:t>1. IDENTIFICAÇÃO DA UNIDADE DEMANDANTE:</w:t>
+        <w:t>IDENTIFICAÇÃO DA UNIDADE DEMANDANTE:</w:t>
       </w:r>
     </w:p>
     <w:tbl>
       <w:tblPr>
         <w:tblStyle w:val="Tabelacomgrade"/>
-        <w:tblW w:type="dxa" w:w="9810"/>
+        <w:tblW w:type="auto" w:w="0"/>
         <w:tblLook w:firstColumn="1" w:firstRow="1" w:lastColumn="0" w:lastRow="0" w:noHBand="0" w:noVBand="1" w:val="04A0"/>
       </w:tblPr>
       <w:tblGrid>
@@ -97,86 +94,31 @@
           </w:p>
         </w:tc>
       </w:tr>
-      <w:tr>
-        <w:tc>
-          <w:tcPr>
-            <w:tcW w:type="dxa" w:w="4905"/>
-          </w:tcPr>
-          <w:p>
-            <w:r>
-              <w:t>Cargo/função:</w:t>
-            </w:r>
-          </w:p>
-        </w:tc>
-        <w:tc>
-          <w:tcPr>
-            <w:tcW w:type="dxa" w:w="4905"/>
-          </w:tcPr>
-          <w:p>
-            <w:r>
-              <w:t>{{CARGO_FUNCAO}}</w:t>
-            </w:r>
-          </w:p>
-        </w:tc>
-      </w:tr>
     </w:tbl>
     <w:p/>
     <w:p>
-      <w:pPr>
-        <w:keepNext/>
-      </w:pPr>
       <w:r>
         <w:rPr>
           <w:b/>
         </w:rPr>
-        <w:t>2. ORIGEM DA DEMANDA:</w:t>
+        <w:t>JUSTIFICATIVA DA NECESSIDADE DA DEMANDA:</w:t>
       </w:r>
     </w:p>
     <w:p>
       <w:pPr>
-        <w:jc w:val="left"/>
+        <w:jc w:val="both"/>
       </w:pPr>
       <w:r>
-        <w:t>(  ) A demanda foi formalizada no DFD para o PCA nº {{NUMERO_DFD_PCA}}, que originou o item {{ITEM_PCA}} do Plano de Contratações Anual de {{ANO_PCA}}. Permanecem válidos os elementos daquele documento, salvo os atualizados neste DFD.</w:t>
-      </w:r>
-    </w:p>
-    <w:p>
-      <w:pPr>
-        <w:jc w:val="left"/>
-      </w:pPr>
-      <w:r>
-        <w:t>(  ) Não há DFD para o PCA anterior relativo a esta demanda.</w:t>
-      </w:r>
-    </w:p>
-    <w:p>
-      <w:pPr>
-        <w:jc w:val="both"/>
-      </w:pPr>
-      <w:r>
-        <w:rPr>
-          <w:b/>
-          <w:color w:val="FF0000"/>
-        </w:rPr>
-        <w:t xml:space="preserve">Orientação (excluir antes da assinatura): </w:t>
-      </w:r>
-      <w:r>
-        <w:rPr>
-          <w:i/>
-          <w:color w:val="FF0000"/>
-        </w:rPr>
-        <w:t>havendo DFD para o PCA atual e completo, as seções 3 a 5 podem remeter a ele ("conforme o DFD para o PCA nº ..."), registrando apenas o que mudou — quantidade, estimativa, data. Se a necessidade, a quantidade ou o contexto mudaram substancialmente, preencher integralmente.</w:t>
+        <w:t>{{JUSTIFICATIVA_NECESSIDADE}}</w:t>
       </w:r>
     </w:p>
     <w:p/>
     <w:p>
-      <w:pPr>
-        <w:keepNext/>
-      </w:pPr>
       <w:r>
         <w:rPr>
           <w:b/>
         </w:rPr>
-        <w:t>3. JUSTIFICATIVA DA NECESSIDADE DA DEMANDA:</w:t>
+        <w:t>DESCRIÇÃO SUCINTA DO OBJETO E QUANTIDADE:</w:t>
       </w:r>
     </w:p>
     <w:p>
@@ -184,38 +126,16 @@
         <w:jc w:val="both"/>
       </w:pPr>
       <w:r>
-        <w:t>{{JUSTIFICATIVA_NECESSIDADE}}</w:t>
-      </w:r>
-    </w:p>
-    <w:p>
-      <w:pPr>
-        <w:jc w:val="both"/>
-      </w:pPr>
-      <w:r>
-        <w:rPr>
-          <w:b/>
-          <w:color w:val="FF0000"/>
-        </w:rPr>
-        <w:t xml:space="preserve">Orientação (excluir antes da assinatura): </w:t>
-      </w:r>
-      <w:r>
-        <w:rPr>
-          <w:i/>
-          <w:color w:val="FF0000"/>
-        </w:rPr>
-        <w:t>responder, de forma objetiva: qual é a situação atual ou o problema; por que há necessidade administrativa; qual o prejuízo ou risco de não atender; qual resultado a Câmara pretende alcançar. Evitar fórmulas genéricas como "necessário ao bom funcionamento".</w:t>
+        <w:t>{{DESCRICAO_OBJETO_QUANTIDADE}}</w:t>
       </w:r>
     </w:p>
     <w:p/>
     <w:p>
-      <w:pPr>
-        <w:keepNext/>
-      </w:pPr>
       <w:r>
         <w:rPr>
           <w:b/>
         </w:rPr>
-        <w:t>4. DESCRIÇÃO SUCINTA DO OBJETO:</w:t>
+        <w:t>ALINHAMENTO AO PLANO DE CONTRATAÇÃO ANUAL (PCA):</w:t>
       </w:r>
     </w:p>
     <w:p>
@@ -223,127 +143,21 @@
         <w:jc w:val="both"/>
       </w:pPr>
       <w:r>
-        <w:t>{{DESCRICAO_OBJETO}}</w:t>
+        <w:t>Identificar o alinhamento da demanda ao Plano de Contratações Anual (PCA) da Câmara Municipal de Itanhandu, publicado em seu sítio eletrônico oficial e no PNCP. Assinale a situação aplicável:</w:t>
       </w:r>
     </w:p>
     <w:p>
       <w:pPr>
-        <w:jc w:val="both"/>
+        <w:jc w:val="left"/>
       </w:pPr>
       <w:r>
-        <w:rPr>
-          <w:b/>
-          <w:color w:val="FF0000"/>
-        </w:rPr>
-        <w:t xml:space="preserve">Orientação (excluir antes da assinatura): </w:t>
-      </w:r>
-      <w:r>
-        <w:rPr>
-          <w:i/>
-          <w:color w:val="FF0000"/>
-        </w:rPr>
-        <w:t>descrever a necessidade, não a solução: sem marca, modelo, especificação técnica detalhada, requisitos de habilitação ou cláusulas de TR, que cabem ao ETP e ao Termo de Referência. É vedada a aquisição de bem de consumo de luxo (Portaria nº 08/2024, art. 3º).</w:t>
-      </w:r>
-    </w:p>
-    <w:p/>
-    <w:p>
-      <w:pPr>
-        <w:keepNext/>
-      </w:pPr>
-      <w:r>
-        <w:rPr>
-          <w:b/>
-        </w:rPr>
-        <w:t>5. QUANTIDADE ESTIMADA:</w:t>
-      </w:r>
-    </w:p>
-    <w:p>
-      <w:pPr>
-        <w:jc w:val="both"/>
-      </w:pPr>
-      <w:r>
-        <w:t>Quantidade: {{QUANTIDADE_ESTIMADA}}</w:t>
-      </w:r>
-    </w:p>
-    <w:p>
-      <w:pPr>
-        <w:jc w:val="both"/>
-      </w:pPr>
-      <w:r>
-        <w:t>Critério utilizado para o dimensionamento: {{CRITERIO_QUANTIDADE}}</w:t>
-      </w:r>
-    </w:p>
-    <w:p>
-      <w:pPr>
-        <w:jc w:val="both"/>
-      </w:pPr>
-      <w:r>
-        <w:rPr>
-          <w:b/>
-          <w:color w:val="FF0000"/>
-        </w:rPr>
-        <w:t xml:space="preserve">Orientação (excluir antes da assinatura): </w:t>
-      </w:r>
-      <w:r>
-        <w:rPr>
-          <w:i/>
-          <w:color w:val="FF0000"/>
-        </w:rPr>
-        <w:t>quando aplicável, considerar a expectativa de consumo anual (art. 3º, III, da Portaria nº 04/2024). Exemplos: "12 unidades, correspondentes aos 12 postos de trabalho que terão equipamentos substituídos"; "24 unidades, com base no consumo dos últimos 12 meses".</w:t>
-      </w:r>
-    </w:p>
-    <w:p/>
-    <w:p>
-      <w:pPr>
-        <w:keepNext/>
-      </w:pPr>
-      <w:r>
-        <w:rPr>
-          <w:b/>
-        </w:rPr>
-        <w:t>6. ALINHAMENTO COM O PLANEJAMENTO ESTRATÉGICO:</w:t>
-      </w:r>
-    </w:p>
-    <w:p>
-      <w:pPr>
-        <w:jc w:val="left"/>
-      </w:pPr>
-      <w:r>
-        <w:t>(  ) A demanda está relacionada ao planejamento estratégico da Câmara. Instrumento e objetivo relacionados: {{ALINHAMENTO_ESTRATEGICO}}.</w:t>
-      </w:r>
-    </w:p>
-    <w:p>
-      <w:pPr>
-        <w:jc w:val="left"/>
-      </w:pPr>
-      <w:r>
-        <w:t>(  ) Não há planejamento estratégico formal aplicável à demanda.</w:t>
-      </w:r>
-    </w:p>
-    <w:p/>
-    <w:p>
-      <w:pPr>
-        <w:keepNext/>
-      </w:pPr>
-      <w:r>
-        <w:rPr>
-          <w:b/>
-        </w:rPr>
-        <w:t>7. SITUAÇÃO DA DEMANDA NO PLANO DE CONTRATAÇÕES ANUAL (PCA):</w:t>
-      </w:r>
-    </w:p>
-    <w:p>
-      <w:pPr>
-        <w:jc w:val="left"/>
-      </w:pPr>
-      <w:r>
-        <w:t>(  ) Prevista no Plano de Contratações Anual de {{ANO_PCA}}, conforme detalhamento a seguir:</w:t>
+        <w:t>(  ) A demanda está prevista no Plano de Contratações Anual, conforme detalhamento a seguir:</w:t>
       </w:r>
     </w:p>
     <w:tbl>
       <w:tblPr>
         <w:tblStyle w:val="Tabelacomgrade"/>
-        <w:tblW w:type="dxa" w:w="9810"/>
+        <w:tblW w:type="auto" w:w="0"/>
         <w:tblLook w:firstColumn="1" w:firstRow="1" w:lastColumn="0" w:lastRow="0" w:noHBand="0" w:noVBand="1" w:val="04A0"/>
       </w:tblPr>
       <w:tblGrid>
@@ -433,7 +247,7 @@
         <w:jc w:val="left"/>
       </w:pPr>
       <w:r>
-        <w:t>(  ) Não prevista no Plano de Contratações Anual. A presente justificativa subsidiará a proposta de alteração do Plano, cuja aprovação compete à Presidência da Câmara Municipal, nos termos do art. 6º da Portaria nº 04/2024: {{JUSTIFICATIVA_INCLUSAO_PCA}}</w:t>
+        <w:t>ou</w:t>
       </w:r>
     </w:p>
     <w:p>
@@ -441,26 +255,15 @@
         <w:jc w:val="both"/>
       </w:pPr>
       <w:r>
-        <w:rPr>
-          <w:b/>
-          <w:color w:val="FF0000"/>
-        </w:rPr>
-        <w:t xml:space="preserve">Orientação (excluir antes da assinatura): </w:t>
-      </w:r>
-      <w:r>
-        <w:rPr>
-          <w:i/>
-          <w:color w:val="FF0000"/>
-        </w:rPr>
-        <w:t>exemplos de justificativa: demanda decorrente de novo projeto aprovado pela Administração e iniciado no exercício corrente; demanda inexistente à época da elaboração do PCA. A alteração do PCA é formalizada pelo DFD para o PCA (finalidade "alteração", com aprovação da Presidência); este DFD não a substitui.</w:t>
+        <w:t>(  ) A demanda não está prevista no Plano de Contratações Anual, e sua inclusão se justifica pelo(s) seguinte(s) motivo(s): {{JUSTIFICATIVA_INCLUSAO_PCA}}</w:t>
       </w:r>
     </w:p>
     <w:p>
       <w:pPr>
-        <w:jc w:val="left"/>
+        <w:jc w:val="both"/>
       </w:pPr>
       <w:r>
-        <w:t>(  ) Dispensada de indicação no PCA, nos termos do art. 2º, § 3º, inciso {{INCISO_DISPENSA_PCA}}, da Portaria nº 04/2024: {{FUNDAMENTO_DISPENSA_PCA}}</w:t>
+        <w:t>A alteração do Plano de Contratações Anual durante o exercício de sua execução depende de justificativa aprovada pela Presidência da Câmara Municipal, nos termos do art. 6º da Portaria nº 04/2024.</w:t>
       </w:r>
     </w:p>
     <w:p>
@@ -468,30 +271,24 @@
         <w:jc w:val="both"/>
       </w:pPr>
       <w:r>
-        <w:rPr>
-          <w:b/>
-          <w:color w:val="FF0000"/>
-        </w:rPr>
-        <w:t xml:space="preserve">Orientação (excluir antes da assinatura): </w:t>
+        <w:t>Exemplos de justificativa: a) demanda decorrente de novo projeto aprovado pela Administração e iniciado no exercício corrente; b) demanda inexistente à época da elaboração do PCA.</w:t>
       </w:r>
+    </w:p>
+    <w:p>
+      <w:pPr>
+        <w:jc w:val="both"/>
+      </w:pPr>
       <w:r>
-        <w:rPr>
-          <w:i/>
-          <w:color w:val="FF0000"/>
-        </w:rPr>
-        <w:t>só se aplica às hipóteses do art. 75, VI, VII e VIII, da Lei nº 14.133/2021 (inciso I) e às pequenas compras e serviços de pronto pagamento do art. 95, § 2º (inciso II). A dispensa em razão do valor (art. 75, I e II) NÃO está dispensada de indicação no PCA.</w:t>
+        <w:t>A inclusão da demanda observa a disponibilidade orçamentária da Câmara Municipal de Itanhandu e não extrapola o orçamento previsto para a unidade.</w:t>
       </w:r>
     </w:p>
     <w:p/>
     <w:p>
-      <w:pPr>
-        <w:keepNext/>
-      </w:pPr>
       <w:r>
         <w:rPr>
           <w:b/>
         </w:rPr>
-        <w:t>8. ESTIMATIVA SUMÁRIA DO VALOR DA CONTRATAÇÃO:</w:t>
+        <w:t>ESTIMATIVA PRELIMINAR DO VALOR DA CONTRATAÇÃO</w:t>
       </w:r>
     </w:p>
     <w:p>
@@ -499,46 +296,16 @@
         <w:jc w:val="both"/>
       </w:pPr>
       <w:r>
-        <w:t>Valor estimado: R$ {{ESTIMATIVA_VALOR}}</w:t>
-      </w:r>
-    </w:p>
-    <w:p>
-      <w:pPr>
-        <w:jc w:val="both"/>
-      </w:pPr>
-      <w:r>
-        <w:t>Referência utilizada para a estimativa: {{FONTE_ESTIMATIVA}}</w:t>
-      </w:r>
-    </w:p>
-    <w:p>
-      <w:pPr>
-        <w:jc w:val="both"/>
-      </w:pPr>
-      <w:r>
-        <w:t>Data da referência ou consulta: {{DATA_ESTIMATIVA}}</w:t>
-      </w:r>
-    </w:p>
-    <w:p>
-      <w:pPr>
-        <w:jc w:val="both"/>
-      </w:pPr>
-      <w:r>
-        <w:rPr>
-          <w:i/>
-        </w:rPr>
-        <w:t>A presente estimativa possui caráter sumário, foi realizada por procedimento simplificado e destina-se ao planejamento inicial da demanda, não substituindo a pesquisa de preços (art. 3º, § 1º, da Portaria nº 04/2024).</w:t>
+        <w:t>{{ESTIMATIVA_VALOR}}</w:t>
       </w:r>
     </w:p>
     <w:p/>
     <w:p>
-      <w:pPr>
-        <w:keepNext/>
-      </w:pPr>
       <w:r>
         <w:rPr>
           <w:b/>
         </w:rPr>
-        <w:t>9. PREVISÃO PARA CONCLUSÃO DA CONTRATAÇÃO OU AQUISIÇÃO DO BEM:</w:t>
+        <w:t>PREVISÃO PARA CONCLUSÃO DA CONTRATAÇÃO OU AQUISIÇÃO DO BEM</w:t>
       </w:r>
     </w:p>
     <w:p>
@@ -551,42 +318,28 @@
     </w:p>
     <w:p/>
     <w:p>
-      <w:pPr>
-        <w:keepNext/>
-      </w:pPr>
       <w:r>
         <w:rPr>
           <w:b/>
         </w:rPr>
-        <w:t>10. VINCULAÇÃO OU DEPENDÊNCIA EM RELAÇÃO A OUTRA CONTRATAÇÃO:</w:t>
+        <w:t>VINCULAÇÃO OU DEPENDÊNCIA EM RELAÇÃO A OUTRA CONTRATAÇÃO</w:t>
       </w:r>
     </w:p>
     <w:p>
       <w:pPr>
-        <w:jc w:val="left"/>
+        <w:jc w:val="both"/>
       </w:pPr>
       <w:r>
-        <w:t>(  ) Não há vinculação ou dependência desta contratação em relação a outra.</w:t>
-      </w:r>
-    </w:p>
-    <w:p>
-      <w:pPr>
-        <w:jc w:val="left"/>
-      </w:pPr>
-      <w:r>
-        <w:t>(  ) Há vinculação ou dependência desta contratação em relação à seguinte: {{VINCULACAO_DEPENDENCIA}}</w:t>
+        <w:t>{{VINCULACAO_DEPENDENCIA}}</w:t>
       </w:r>
     </w:p>
     <w:p/>
     <w:p>
-      <w:pPr>
-        <w:keepNext/>
-      </w:pPr>
       <w:r>
         <w:rPr>
           <w:b/>
         </w:rPr>
-        <w:t>11. GRAU DE PRIORIDADE DA DEMANDA:</w:t>
+        <w:t>GRAU DE PRIORIDADE DA DEMANDA</w:t>
       </w:r>
     </w:p>
     <w:p>
@@ -602,72 +355,29 @@
         <w:jc w:val="both"/>
       </w:pPr>
       <w:r>
-        <w:t>Enquadramento: art. 3º, § 2º, inciso {{INCISO_PRIORIDADE}}, alínea {{ALINEA_PRIORIDADE}} (se houver), da Portaria nº 04/2024.</w:t>
-      </w:r>
-    </w:p>
-    <w:p>
-      <w:pPr>
-        <w:jc w:val="both"/>
-      </w:pPr>
-      <w:r>
-        <w:t>Justificativa do enquadramento: {{JUSTIFICATIVA_PRIORIDADE}}</w:t>
-      </w:r>
-    </w:p>
-    <w:p>
-      <w:pPr>
-        <w:jc w:val="both"/>
-      </w:pPr>
-      <w:r>
-        <w:rPr>
-          <w:b/>
-          <w:color w:val="FF0000"/>
-        </w:rPr>
-        <w:t xml:space="preserve">Orientação (excluir antes da assinatura): </w:t>
-      </w:r>
-      <w:r>
-        <w:rPr>
-          <w:i/>
-          <w:color w:val="FF0000"/>
-        </w:rPr>
-        <w:t>ALTA (inciso I): a) renovação ou prorrogação de serviço continuado em execução; b) material de consumo ou serviço cuja falta possa comprometer o funcionamento da Câmara; c) atendimento de prazo legal, decisão judicial ou determinação de órgão de controle; d) contratação acessória ou vinculada a outra de prioridade alta; e) assim classificada pelo Presidente. MÉDIA (inciso II, sem alíneas): serviço sem contratação vigente; material de consumo não compreendido no inciso I; bem permanente para substituir bem danificado ou deteriorado; acessória ou vinculada a contratação de prioridade média. BAIXA (inciso III): bem permanente que não substitua outro existente; obras e serviços não incluídos nos incisos I e II. Não marcar prioridade sem enquadramento.</w:t>
+        <w:t>Classificação conforme os critérios do art. 3º, §2º, da Portaria nº 04/2024. Justificativa do enquadramento: {{JUSTIFICATIVA_PRIORIDADE}}</w:t>
       </w:r>
     </w:p>
     <w:p/>
     <w:p>
       <w:pPr>
-        <w:keepNext/>
         <w:jc w:val="left"/>
       </w:pPr>
       <w:r>
         <w:t>Itanhandu/MG, {{DATA_ASSINATURA}}.</w:t>
       </w:r>
     </w:p>
+    <w:p/>
     <w:p>
       <w:pPr>
-        <w:keepNext/>
         <w:jc w:val="left"/>
       </w:pPr>
-      <w:r/>
-    </w:p>
-    <w:p>
-      <w:pPr>
-        <w:keepNext/>
-        <w:jc w:val="left"/>
-      </w:pPr>
-      <w:r/>
-    </w:p>
-    <w:p>
-      <w:pPr>
-        <w:keepNext/>
-        <w:jc w:val="left"/>
-      </w:pPr>
       <w:r>
-        <w:t>___________________________________________</w:t>
+        <w:t>Assinado eletronicamente</w:t>
       </w:r>
     </w:p>
     <w:p>
       <w:pPr>
-        <w:keepNext/>
         <w:jc w:val="left"/>
       </w:pPr>
       <w:r>
@@ -679,7 +389,7 @@
         <w:jc w:val="left"/>
       </w:pPr>
       <w:r>
-        <w:t>{{CARGO_FUNCAO}} — Requisitante</w:t>
+        <w:t>Requisitante</w:t>
       </w:r>
     </w:p>
     <w:sectPr>

</xml_diff>